<commit_message>
acronym added in the paper
</commit_message>
<xml_diff>
--- a/review/letter.docx
+++ b/review/letter.docx
@@ -2,6 +2,34 @@
 <file path=word/document.xml><?xml version="1.0" encoding="utf-8"?>
 <w:document xmlns:wpc="http://schemas.microsoft.com/office/word/2010/wordprocessingCanvas" xmlns:mc="http://schemas.openxmlformats.org/markup-compatibility/2006" xmlns:o="urn:schemas-microsoft-com:office:office" xmlns:r="http://schemas.openxmlformats.org/officeDocument/2006/relationships" xmlns:m="http://schemas.openxmlformats.org/officeDocument/2006/math" xmlns:v="urn:schemas-microsoft-com:vml" xmlns:wp="http://schemas.openxmlformats.org/drawingml/2006/wordprocessingDrawing" xmlns:w="http://schemas.openxmlformats.org/wordprocessingml/2006/main" xmlns:wpg="http://schemas.microsoft.com/office/word/2010/wordprocessingGroup" xmlns:wpi="http://schemas.microsoft.com/office/word/2010/wordprocessingInk" xmlns:a="http://schemas.openxmlformats.org/drawingml/2006/main" xmlns:wne="http://schemas.microsoft.com/office/word/2006/wordml" xmlns:wps="http://schemas.microsoft.com/office/word/2010/wordprocessingShape" xmlns:w10="urn:schemas-microsoft-com:office:word" xmlns:wp14="http://schemas.microsoft.com/office/word/2010/wordprocessingDrawing" xmlns:w14="http://schemas.microsoft.com/office/word/2010/wordml" xmlns:w15="http://schemas.microsoft.com/office/word/2012/wordml" xmlns:w16cex="http://schemas.microsoft.com/office/word/2018/wordml/cex" xmlns:w16cid="http://schemas.microsoft.com/office/word/2016/wordml/cid" xmlns:w16="http://schemas.microsoft.com/office/word/2018/wordml" xmlns:w16sdtdh="http://schemas.microsoft.com/office/word/2020/wordml/sdtdatahash" xmlns:w16se="http://schemas.microsoft.com/office/word/2015/wordml/symex" mc:Ignorable="w14 w15 w16se w16cid w16 w16cex w16sdtdh wp14">
   <w:body>
+    <w:p>
+      <w:pPr>
+        <w:pStyle w:val="140"/>
+        <w:pBdr/>
+        <w:spacing/>
+        <w:ind/>
+        <w:rPr/>
+      </w:pPr>
+      <w:r/>
+      <w:r/>
+      <w:r/>
+    </w:p>
+    <w:p>
+      <w:pPr>
+        <w:pStyle w:val="140"/>
+        <w:pBdr/>
+        <w:spacing/>
+        <w:ind/>
+        <w:rPr/>
+      </w:pPr>
+      <w:r>
+        <w:rPr>
+          <w:lang w:val="en-CA"/>
+        </w:rPr>
+        <w:t xml:space="preserve">Reviewer 1</w:t>
+      </w:r>
+      <w:r/>
+    </w:p>
     <w:tbl>
       <w:tblPr>
         <w:tblStyle w:val="12"/>
@@ -381,6 +409,452 @@
               <w:ind/>
               <w:rPr/>
             </w:pPr>
+            <w:r/>
+            <w:r/>
+          </w:p>
+        </w:tc>
+      </w:tr>
+    </w:tbl>
+    <w:p>
+      <w:pPr>
+        <w:pBdr/>
+        <w:spacing/>
+        <w:ind/>
+        <w:rPr/>
+      </w:pPr>
+      <w:r/>
+      <w:r/>
+      <w:r/>
+    </w:p>
+    <w:p>
+      <w:pPr>
+        <w:pStyle w:val="140"/>
+        <w:pBdr/>
+        <w:spacing/>
+        <w:ind/>
+        <w:rPr/>
+      </w:pPr>
+      <w:r>
+        <w:rPr>
+          <w:lang w:val="en-CA"/>
+        </w:rPr>
+        <w:t xml:space="preserve">Reviewer 2</w:t>
+      </w:r>
+      <w:r/>
+      <w:r/>
+      <w:r/>
+      <w:r/>
+      <w:r/>
+    </w:p>
+    <w:tbl>
+      <w:tblPr>
+        <w:tblStyle w:val="12"/>
+        <w:tblW w:w="0" w:type="auto"/>
+        <w:tblBorders/>
+        <w:tblLook w:val="04A0" w:firstRow="1" w:lastRow="0" w:firstColumn="1" w:lastColumn="0" w:noHBand="0" w:noVBand="1"/>
+      </w:tblPr>
+      <w:tblGrid>
+        <w:gridCol w:w="2339"/>
+        <w:gridCol w:w="2339"/>
+        <w:gridCol w:w="2339"/>
+      </w:tblGrid>
+      <w:tr>
+        <w:trPr/>
+        <w:tc>
+          <w:tcPr>
+            <w:tcBorders/>
+            <w:tcW w:w="2339" w:type="dxa"/>
+          </w:tcPr>
+          <w:p>
+            <w:pPr>
+              <w:pBdr/>
+              <w:spacing/>
+              <w:ind/>
+              <w:rPr/>
+            </w:pPr>
+            <w:r>
+              <w:rPr>
+                <w:lang w:val="en-CA"/>
+              </w:rPr>
+              <w:t xml:space="preserve">Reviewer comment</w:t>
+            </w:r>
+            <w:r/>
+            <w:r/>
+          </w:p>
+        </w:tc>
+        <w:tc>
+          <w:tcPr>
+            <w:tcBorders/>
+            <w:tcW w:w="2339" w:type="dxa"/>
+          </w:tcPr>
+          <w:p>
+            <w:pPr>
+              <w:pBdr/>
+              <w:spacing/>
+              <w:ind/>
+              <w:rPr/>
+            </w:pPr>
+            <w:r>
+              <w:rPr>
+                <w:lang w:val="en-CA"/>
+              </w:rPr>
+              <w:t xml:space="preserve">Author response</w:t>
+            </w:r>
+            <w:r/>
+            <w:r/>
+          </w:p>
+        </w:tc>
+        <w:tc>
+          <w:tcPr>
+            <w:tcBorders/>
+            <w:tcW w:w="2339" w:type="dxa"/>
+          </w:tcPr>
+          <w:p>
+            <w:pPr>
+              <w:pBdr/>
+              <w:spacing/>
+              <w:ind/>
+              <w:rPr/>
+            </w:pPr>
+            <w:r>
+              <w:rPr>
+                <w:lang w:val="en-CA"/>
+              </w:rPr>
+              <w:t xml:space="preserve">Change</w:t>
+            </w:r>
+            <w:r/>
+            <w:r/>
+          </w:p>
+        </w:tc>
+      </w:tr>
+      <w:tr>
+        <w:trPr/>
+        <w:tc>
+          <w:tcPr>
+            <w:tcBorders/>
+            <w:tcW w:w="2339" w:type="dxa"/>
+          </w:tcPr>
+          <w:p>
+            <w:pPr>
+              <w:pBdr/>
+              <w:spacing/>
+              <w:ind/>
+              <w:rPr/>
+            </w:pPr>
+            <w:r/>
+            <w:r>
+              <w:t xml:space="preserve">Define **IRI** before first use (lines 16–19).</w:t>
+            </w:r>
+            <w:r/>
+            <w:r/>
+            <w:r/>
+          </w:p>
+        </w:tc>
+        <w:tc>
+          <w:tcPr>
+            <w:tcBorders/>
+            <w:tcW w:w="2339" w:type="dxa"/>
+          </w:tcPr>
+          <w:p>
+            <w:pPr>
+              <w:pBdr/>
+              <w:spacing/>
+              <w:ind/>
+              <w:rPr/>
+            </w:pPr>
+            <w:r/>
+            <w:r/>
+            <w:r/>
+          </w:p>
+        </w:tc>
+        <w:tc>
+          <w:tcPr>
+            <w:tcBorders/>
+            <w:tcW w:w="2339" w:type="dxa"/>
+          </w:tcPr>
+          <w:p>
+            <w:pPr>
+              <w:pBdr/>
+              <w:spacing/>
+              <w:ind/>
+              <w:rPr/>
+            </w:pPr>
+            <w:r>
+              <w:rPr>
+                <w:lang w:val="en-CA"/>
+              </w:rPr>
+              <w:t xml:space="preserve">We now define it.</w:t>
+            </w:r>
+            <w:r/>
+            <w:r/>
+          </w:p>
+        </w:tc>
+      </w:tr>
+      <w:tr>
+        <w:trPr/>
+        <w:tc>
+          <w:tcPr>
+            <w:tcBorders/>
+            <w:tcW w:w="2339" w:type="dxa"/>
+          </w:tcPr>
+          <w:p>
+            <w:pPr>
+              <w:pBdr/>
+              <w:spacing/>
+              <w:ind/>
+              <w:rPr/>
+            </w:pPr>
+            <w:r/>
+            <w:r/>
+            <w:r/>
+          </w:p>
+        </w:tc>
+        <w:tc>
+          <w:tcPr>
+            <w:tcBorders/>
+            <w:tcW w:w="2339" w:type="dxa"/>
+          </w:tcPr>
+          <w:p>
+            <w:pPr>
+              <w:pBdr/>
+              <w:spacing/>
+              <w:ind/>
+              <w:rPr/>
+            </w:pPr>
+            <w:r/>
+            <w:r/>
+            <w:r/>
+          </w:p>
+        </w:tc>
+        <w:tc>
+          <w:tcPr>
+            <w:tcBorders/>
+            <w:tcW w:w="2339" w:type="dxa"/>
+          </w:tcPr>
+          <w:p>
+            <w:pPr>
+              <w:pBdr/>
+              <w:spacing/>
+              <w:ind/>
+              <w:rPr/>
+            </w:pPr>
+            <w:r/>
+            <w:r/>
+            <w:r/>
+          </w:p>
+        </w:tc>
+      </w:tr>
+      <w:tr>
+        <w:trPr/>
+        <w:tc>
+          <w:tcPr>
+            <w:tcBorders/>
+            <w:tcW w:w="2339" w:type="dxa"/>
+          </w:tcPr>
+          <w:p>
+            <w:pPr>
+              <w:pBdr/>
+              <w:spacing/>
+              <w:ind/>
+              <w:rPr/>
+            </w:pPr>
+            <w:r/>
+            <w:r/>
+            <w:r/>
+          </w:p>
+        </w:tc>
+        <w:tc>
+          <w:tcPr>
+            <w:tcBorders/>
+            <w:tcW w:w="2339" w:type="dxa"/>
+          </w:tcPr>
+          <w:p>
+            <w:pPr>
+              <w:pBdr/>
+              <w:spacing/>
+              <w:ind/>
+              <w:rPr/>
+            </w:pPr>
+            <w:r/>
+            <w:r/>
+            <w:r/>
+          </w:p>
+        </w:tc>
+        <w:tc>
+          <w:tcPr>
+            <w:tcBorders/>
+            <w:tcW w:w="2339" w:type="dxa"/>
+          </w:tcPr>
+          <w:p>
+            <w:pPr>
+              <w:pBdr/>
+              <w:spacing/>
+              <w:ind/>
+              <w:rPr/>
+            </w:pPr>
+            <w:r/>
+            <w:r/>
+            <w:r/>
+          </w:p>
+        </w:tc>
+      </w:tr>
+      <w:tr>
+        <w:trPr/>
+        <w:tc>
+          <w:tcPr>
+            <w:tcBorders/>
+            <w:tcW w:w="2339" w:type="dxa"/>
+          </w:tcPr>
+          <w:p>
+            <w:pPr>
+              <w:pBdr/>
+              <w:spacing/>
+              <w:ind/>
+              <w:rPr/>
+            </w:pPr>
+            <w:r/>
+            <w:r/>
+            <w:r/>
+          </w:p>
+        </w:tc>
+        <w:tc>
+          <w:tcPr>
+            <w:tcBorders/>
+            <w:tcW w:w="2339" w:type="dxa"/>
+          </w:tcPr>
+          <w:p>
+            <w:pPr>
+              <w:pBdr/>
+              <w:spacing/>
+              <w:ind/>
+              <w:rPr/>
+            </w:pPr>
+            <w:r/>
+            <w:r/>
+            <w:r/>
+          </w:p>
+        </w:tc>
+        <w:tc>
+          <w:tcPr>
+            <w:tcBorders/>
+            <w:tcW w:w="2339" w:type="dxa"/>
+          </w:tcPr>
+          <w:p>
+            <w:pPr>
+              <w:pBdr/>
+              <w:spacing/>
+              <w:ind/>
+              <w:rPr/>
+            </w:pPr>
+            <w:r/>
+            <w:r/>
+            <w:r/>
+          </w:p>
+        </w:tc>
+      </w:tr>
+      <w:tr>
+        <w:trPr/>
+        <w:tc>
+          <w:tcPr>
+            <w:tcBorders/>
+            <w:tcW w:w="2339" w:type="dxa"/>
+          </w:tcPr>
+          <w:p>
+            <w:pPr>
+              <w:pBdr/>
+              <w:spacing/>
+              <w:ind/>
+              <w:rPr/>
+            </w:pPr>
+            <w:r/>
+            <w:r/>
+            <w:r/>
+          </w:p>
+        </w:tc>
+        <w:tc>
+          <w:tcPr>
+            <w:tcBorders/>
+            <w:tcW w:w="2339" w:type="dxa"/>
+          </w:tcPr>
+          <w:p>
+            <w:pPr>
+              <w:pBdr/>
+              <w:spacing/>
+              <w:ind/>
+              <w:rPr/>
+            </w:pPr>
+            <w:r/>
+            <w:r/>
+            <w:r/>
+          </w:p>
+        </w:tc>
+        <w:tc>
+          <w:tcPr>
+            <w:tcBorders/>
+            <w:tcW w:w="2339" w:type="dxa"/>
+          </w:tcPr>
+          <w:p>
+            <w:pPr>
+              <w:pBdr/>
+              <w:spacing/>
+              <w:ind/>
+              <w:rPr/>
+            </w:pPr>
+            <w:r/>
+            <w:r/>
+            <w:r/>
+          </w:p>
+        </w:tc>
+      </w:tr>
+      <w:tr>
+        <w:trPr/>
+        <w:tc>
+          <w:tcPr>
+            <w:tcBorders/>
+            <w:tcW w:w="2339" w:type="dxa"/>
+          </w:tcPr>
+          <w:p>
+            <w:pPr>
+              <w:pBdr/>
+              <w:spacing/>
+              <w:ind/>
+              <w:rPr/>
+            </w:pPr>
+            <w:r/>
+            <w:r/>
+            <w:r/>
+          </w:p>
+        </w:tc>
+        <w:tc>
+          <w:tcPr>
+            <w:tcBorders/>
+            <w:tcW w:w="2339" w:type="dxa"/>
+          </w:tcPr>
+          <w:p>
+            <w:pPr>
+              <w:pBdr/>
+              <w:spacing/>
+              <w:ind/>
+              <w:rPr/>
+            </w:pPr>
+            <w:r/>
+            <w:r/>
+            <w:r/>
+          </w:p>
+        </w:tc>
+        <w:tc>
+          <w:tcPr>
+            <w:tcBorders/>
+            <w:tcW w:w="2339" w:type="dxa"/>
+          </w:tcPr>
+          <w:p>
+            <w:pPr>
+              <w:pBdr/>
+              <w:spacing/>
+              <w:ind/>
+              <w:rPr/>
+            </w:pPr>
+            <w:r/>
             <w:r/>
             <w:r/>
           </w:p>

</xml_diff>